<commit_message>
Fixed and added new data and scripts
</commit_message>
<xml_diff>
--- a/AppSec/36_Custom_Rules/nuclei.docx
+++ b/AppSec/36_Custom_Rules/nuclei.docx
@@ -596,7 +596,6 @@
         <w:rPr>
           <w:rFonts w:ascii="Times New Roman" w:hAnsi="Times New Roman" w:cs="Times New Roman"/>
           <w:sz w:val="24"/>
-          <w:lang w:val="en-US"/>
         </w:rPr>
       </w:pPr>
       <w:r>
@@ -818,14 +817,7 @@
           <w:rFonts w:ascii="Times New Roman" w:hAnsi="Times New Roman" w:cs="Times New Roman"/>
           <w:sz w:val="24"/>
         </w:rPr>
-        <w:t xml:space="preserve">3. </w:t>
-      </w:r>
-      <w:r>
-        <w:rPr>
-          <w:rFonts w:ascii="Times New Roman" w:hAnsi="Times New Roman" w:cs="Times New Roman"/>
-          <w:sz w:val="24"/>
-        </w:rPr>
-        <w:t xml:space="preserve">Написание собственных </w:t>
+        <w:t xml:space="preserve">3. Написание собственных </w:t>
       </w:r>
       <w:r>
         <w:rPr>
@@ -2059,16 +2051,37 @@
         <w:rPr>
           <w:rFonts w:ascii="Arial Narrow" w:eastAsia="AR PL UKai CN" w:hAnsi="Arial Narrow" w:cs="Times New Roman"/>
           <w:sz w:val="24"/>
-          <w:lang w:val="en-US"/>
-        </w:rPr>
-      </w:pPr>
-      <w:r>
-        <w:rPr>
-          <w:rFonts w:ascii="Arial Narrow" w:eastAsia="AR PL UKai CN" w:hAnsi="Arial Narrow" w:cs="Times New Roman"/>
-          <w:sz w:val="24"/>
-          <w:lang w:val="en-US"/>
-        </w:rPr>
-        <w:t xml:space="preserve">          - "(document\\.</w:t>
+        </w:rPr>
+      </w:pPr>
+      <w:r>
+        <w:rPr>
+          <w:rFonts w:ascii="Arial Narrow" w:eastAsia="AR PL UKai CN" w:hAnsi="Arial Narrow" w:cs="Times New Roman"/>
+          <w:sz w:val="24"/>
+          <w:lang w:val="en-US"/>
+        </w:rPr>
+        <w:t xml:space="preserve">          </w:t>
+      </w:r>
+      <w:r>
+        <w:rPr>
+          <w:rFonts w:ascii="Arial Narrow" w:eastAsia="AR PL UKai CN" w:hAnsi="Arial Narrow" w:cs="Times New Roman"/>
+          <w:sz w:val="24"/>
+        </w:rPr>
+        <w:t>- "(</w:t>
+      </w:r>
+      <w:r>
+        <w:rPr>
+          <w:rFonts w:ascii="Arial Narrow" w:eastAsia="AR PL UKai CN" w:hAnsi="Arial Narrow" w:cs="Times New Roman"/>
+          <w:sz w:val="24"/>
+          <w:lang w:val="en-US"/>
+        </w:rPr>
+        <w:t>document</w:t>
+      </w:r>
+      <w:r>
+        <w:rPr>
+          <w:rFonts w:ascii="Arial Narrow" w:eastAsia="AR PL UKai CN" w:hAnsi="Arial Narrow" w:cs="Times New Roman"/>
+          <w:sz w:val="24"/>
+        </w:rPr>
+        <w:t>\\.</w:t>
       </w:r>
       <w:proofErr w:type="spellStart"/>
       <w:r>
@@ -2084,9 +2097,41 @@
         <w:rPr>
           <w:rFonts w:ascii="Arial Narrow" w:eastAsia="AR PL UKai CN" w:hAnsi="Arial Narrow" w:cs="Times New Roman"/>
           <w:sz w:val="24"/>
-          <w:lang w:val="en-US"/>
-        </w:rPr>
-        <w:t>\</w:t>
+        </w:rPr>
+        <w:t>\\([^;]+</w:t>
+      </w:r>
+      <w:proofErr w:type="spellStart"/>
+      <w:r>
+        <w:rPr>
+          <w:rFonts w:ascii="Arial Narrow" w:eastAsia="AR PL UKai CN" w:hAnsi="Arial Narrow" w:cs="Times New Roman"/>
+          <w:sz w:val="24"/>
+          <w:lang w:val="en-US"/>
+        </w:rPr>
+        <w:t>innerHTML</w:t>
+      </w:r>
+      <w:proofErr w:type="spellEnd"/>
+      <w:r>
+        <w:rPr>
+          <w:rFonts w:ascii="Arial Narrow" w:eastAsia="AR PL UKai CN" w:hAnsi="Arial Narrow" w:cs="Times New Roman"/>
+          <w:sz w:val="24"/>
+        </w:rPr>
+        <w:t>[^;]+)"</w:t>
+      </w:r>
+    </w:p>
+    <w:p>
+      <w:pPr>
+        <w:spacing w:after="0" w:line="240" w:lineRule="atLeast"/>
+        <w:rPr>
+          <w:rFonts w:ascii="Arial Narrow" w:eastAsia="AR PL UKai CN" w:hAnsi="Arial Narrow" w:cs="Times New Roman"/>
+          <w:sz w:val="24"/>
+        </w:rPr>
+      </w:pPr>
+      <w:r>
+        <w:rPr>
+          <w:rFonts w:ascii="Arial Narrow" w:eastAsia="AR PL UKai CN" w:hAnsi="Arial Narrow" w:cs="Times New Roman"/>
+          <w:sz w:val="24"/>
+        </w:rPr>
+        <w:t xml:space="preserve">        </w:t>
       </w:r>
       <w:proofErr w:type="gramStart"/>
       <w:r>
@@ -2095,83 +2140,253 @@
           <w:sz w:val="24"/>
           <w:lang w:val="en-US"/>
         </w:rPr>
-        <w:t>\(</w:t>
+        <w:t>group</w:t>
       </w:r>
       <w:proofErr w:type="gramEnd"/>
       <w:r>
         <w:rPr>
           <w:rFonts w:ascii="Arial Narrow" w:eastAsia="AR PL UKai CN" w:hAnsi="Arial Narrow" w:cs="Times New Roman"/>
           <w:sz w:val="24"/>
-          <w:lang w:val="en-US"/>
-        </w:rPr>
-        <w:t>[^;]+</w:t>
-      </w:r>
-      <w:proofErr w:type="spellStart"/>
-      <w:r>
-        <w:rPr>
-          <w:rFonts w:ascii="Arial Narrow" w:eastAsia="AR PL UKai CN" w:hAnsi="Arial Narrow" w:cs="Times New Roman"/>
-          <w:sz w:val="24"/>
-          <w:lang w:val="en-US"/>
-        </w:rPr>
-        <w:t>innerHTML</w:t>
-      </w:r>
-      <w:proofErr w:type="spellEnd"/>
-      <w:r>
-        <w:rPr>
-          <w:rFonts w:ascii="Arial Narrow" w:eastAsia="AR PL UKai CN" w:hAnsi="Arial Narrow" w:cs="Times New Roman"/>
-          <w:sz w:val="24"/>
-          <w:lang w:val="en-US"/>
-        </w:rPr>
-        <w:t>[^;]+)"</w:t>
-      </w:r>
-    </w:p>
-    <w:p>
-      <w:pPr>
-        <w:spacing w:after="0" w:line="240" w:lineRule="atLeast"/>
-        <w:rPr>
-          <w:rFonts w:ascii="Arial Narrow" w:eastAsia="AR PL UKai CN" w:hAnsi="Arial Narrow" w:cs="Times New Roman"/>
-          <w:sz w:val="24"/>
-          <w:lang w:val="en-US"/>
-        </w:rPr>
-      </w:pPr>
-      <w:r>
-        <w:rPr>
-          <w:rFonts w:ascii="Arial Narrow" w:eastAsia="AR PL UKai CN" w:hAnsi="Arial Narrow" w:cs="Times New Roman"/>
-          <w:sz w:val="24"/>
-          <w:lang w:val="en-US"/>
-        </w:rPr>
-        <w:t xml:space="preserve">        </w:t>
-      </w:r>
+        </w:rPr>
+        <w:t xml:space="preserve">: 1 </w:t>
+      </w:r>
+    </w:p>
+    <w:p>
+      <w:pPr>
+        <w:ind w:firstLine="708"/>
+        <w:rPr>
+          <w:rFonts w:ascii="Times New Roman" w:hAnsi="Times New Roman" w:cs="Times New Roman"/>
+          <w:sz w:val="24"/>
+        </w:rPr>
+      </w:pPr>
+      <w:r>
+        <w:rPr>
+          <w:rFonts w:ascii="Times New Roman" w:hAnsi="Times New Roman" w:cs="Times New Roman"/>
+          <w:sz w:val="24"/>
+        </w:rPr>
+        <w:t xml:space="preserve">Использовано 3 </w:t>
+      </w:r>
+      <w:proofErr w:type="spellStart"/>
+      <w:r>
+        <w:rPr>
+          <w:rFonts w:ascii="Times New Roman" w:hAnsi="Times New Roman" w:cs="Times New Roman"/>
+          <w:sz w:val="24"/>
+        </w:rPr>
+        <w:t>matcher</w:t>
+      </w:r>
+      <w:proofErr w:type="spellEnd"/>
+      <w:r>
+        <w:rPr>
+          <w:rFonts w:ascii="Times New Roman" w:hAnsi="Times New Roman" w:cs="Times New Roman"/>
+          <w:sz w:val="24"/>
+        </w:rPr>
+        <w:t xml:space="preserve"> для улучшенного обнаружения</w:t>
+      </w:r>
+      <w:r>
+        <w:rPr>
+          <w:rFonts w:ascii="Times New Roman" w:hAnsi="Times New Roman" w:cs="Times New Roman"/>
+          <w:sz w:val="24"/>
+        </w:rPr>
+        <w:t xml:space="preserve">, а также выведена строка, в которой найдена проблема. </w:t>
+      </w:r>
+    </w:p>
+    <w:p>
+      <w:pPr>
+        <w:rPr>
+          <w:rFonts w:ascii="Times New Roman" w:hAnsi="Times New Roman" w:cs="Times New Roman"/>
+          <w:sz w:val="24"/>
+        </w:rPr>
+      </w:pPr>
+      <w:r>
+        <w:rPr>
+          <w:rFonts w:ascii="Times New Roman" w:hAnsi="Times New Roman" w:cs="Times New Roman"/>
+          <w:sz w:val="24"/>
+        </w:rPr>
+        <w:t>Шаблоны</w:t>
+      </w:r>
+      <w:r>
+        <w:rPr>
+          <w:rFonts w:ascii="Times New Roman" w:hAnsi="Times New Roman" w:cs="Times New Roman"/>
+          <w:sz w:val="24"/>
+        </w:rPr>
+        <w:t xml:space="preserve"> </w:t>
+      </w:r>
+      <w:r>
+        <w:rPr>
+          <w:rFonts w:ascii="Times New Roman" w:hAnsi="Times New Roman" w:cs="Times New Roman"/>
+          <w:sz w:val="24"/>
+        </w:rPr>
+        <w:t>валидны</w:t>
+      </w:r>
+      <w:r>
+        <w:rPr>
+          <w:rFonts w:ascii="Times New Roman" w:hAnsi="Times New Roman" w:cs="Times New Roman"/>
+          <w:sz w:val="24"/>
+        </w:rPr>
+        <w:t>:</w:t>
+      </w:r>
+    </w:p>
+    <w:p>
+      <w:pPr>
+        <w:rPr>
+          <w:rFonts w:ascii="Times New Roman" w:hAnsi="Times New Roman" w:cs="Times New Roman"/>
+          <w:b/>
+          <w:sz w:val="24"/>
+          <w:lang w:val="en-US"/>
+        </w:rPr>
+      </w:pPr>
       <w:proofErr w:type="gramStart"/>
       <w:r>
         <w:rPr>
-          <w:rFonts w:ascii="Arial Narrow" w:eastAsia="AR PL UKai CN" w:hAnsi="Arial Narrow" w:cs="Times New Roman"/>
-          <w:sz w:val="24"/>
-          <w:lang w:val="en-US"/>
-        </w:rPr>
-        <w:t>group</w:t>
+          <w:rFonts w:ascii="Times New Roman" w:hAnsi="Times New Roman" w:cs="Times New Roman"/>
+          <w:b/>
+          <w:sz w:val="24"/>
+          <w:lang w:val="en-US"/>
+        </w:rPr>
+        <w:t>nuclei</w:t>
       </w:r>
       <w:proofErr w:type="gramEnd"/>
       <w:r>
         <w:rPr>
-          <w:rFonts w:ascii="Arial Narrow" w:eastAsia="AR PL UKai CN" w:hAnsi="Arial Narrow" w:cs="Times New Roman"/>
-          <w:sz w:val="24"/>
-          <w:lang w:val="en-US"/>
-        </w:rPr>
-        <w:t>: 1</w:t>
-      </w:r>
-      <w:r>
-        <w:rPr>
-          <w:rFonts w:ascii="Arial Narrow" w:eastAsia="AR PL UKai CN" w:hAnsi="Arial Narrow" w:cs="Times New Roman"/>
-          <w:sz w:val="24"/>
-          <w:lang w:val="en-US"/>
+          <w:rFonts w:ascii="Times New Roman" w:hAnsi="Times New Roman" w:cs="Times New Roman"/>
+          <w:b/>
+          <w:sz w:val="24"/>
+          <w:lang w:val="en-US"/>
+        </w:rPr>
+        <w:t xml:space="preserve"> -validate -t </w:t>
+      </w:r>
+      <w:proofErr w:type="spellStart"/>
+      <w:r>
+        <w:rPr>
+          <w:rFonts w:ascii="Times New Roman" w:hAnsi="Times New Roman" w:cs="Times New Roman"/>
+          <w:b/>
+          <w:sz w:val="24"/>
+          <w:lang w:val="en-US"/>
+        </w:rPr>
+        <w:t>cves</w:t>
+      </w:r>
+      <w:proofErr w:type="spellEnd"/>
+      <w:r>
+        <w:rPr>
+          <w:rFonts w:ascii="Times New Roman" w:hAnsi="Times New Roman" w:cs="Times New Roman"/>
+          <w:b/>
+          <w:sz w:val="24"/>
+          <w:lang w:val="en-US"/>
+        </w:rPr>
+        <w:t>/</w:t>
+      </w:r>
+    </w:p>
+    <w:p>
+      <w:pPr>
+        <w:spacing w:after="0" w:line="240" w:lineRule="atLeast"/>
+        <w:rPr>
+          <w:rFonts w:ascii="Times New Roman" w:hAnsi="Times New Roman" w:cs="Times New Roman"/>
+          <w:sz w:val="24"/>
+          <w:lang w:val="en-US"/>
+        </w:rPr>
+      </w:pPr>
+      <w:r>
+        <w:rPr>
+          <w:rFonts w:ascii="Times New Roman" w:hAnsi="Times New Roman" w:cs="Times New Roman"/>
+          <w:sz w:val="24"/>
+          <w:lang w:val="en-US"/>
+        </w:rPr>
+        <w:t>[VER] Started metrics server at localhost</w:t>
+      </w:r>
+      <w:proofErr w:type="gramStart"/>
+      <w:r>
+        <w:rPr>
+          <w:rFonts w:ascii="Times New Roman" w:hAnsi="Times New Roman" w:cs="Times New Roman"/>
+          <w:sz w:val="24"/>
+          <w:lang w:val="en-US"/>
+        </w:rPr>
+        <w:t>:9092</w:t>
+      </w:r>
+      <w:proofErr w:type="gramEnd"/>
+    </w:p>
+    <w:p>
+      <w:pPr>
+        <w:spacing w:after="0" w:line="240" w:lineRule="atLeast"/>
+        <w:rPr>
+          <w:rFonts w:ascii="Times New Roman" w:hAnsi="Times New Roman" w:cs="Times New Roman"/>
+          <w:sz w:val="24"/>
+        </w:rPr>
+      </w:pPr>
+      <w:r>
+        <w:rPr>
+          <w:rFonts w:ascii="Times New Roman" w:hAnsi="Times New Roman" w:cs="Times New Roman"/>
+          <w:sz w:val="24"/>
+        </w:rPr>
+        <w:t xml:space="preserve">[INF] </w:t>
+      </w:r>
+      <w:proofErr w:type="spellStart"/>
+      <w:r>
+        <w:rPr>
+          <w:rFonts w:ascii="Times New Roman" w:hAnsi="Times New Roman" w:cs="Times New Roman"/>
+          <w:sz w:val="24"/>
+        </w:rPr>
+        <w:t>All</w:t>
+      </w:r>
+      <w:proofErr w:type="spellEnd"/>
+      <w:r>
+        <w:rPr>
+          <w:rFonts w:ascii="Times New Roman" w:hAnsi="Times New Roman" w:cs="Times New Roman"/>
+          <w:sz w:val="24"/>
         </w:rPr>
         <w:t xml:space="preserve"> </w:t>
       </w:r>
-    </w:p>
-    <w:p>
-      <w:pPr>
-        <w:ind w:firstLine="708"/>
+      <w:proofErr w:type="spellStart"/>
+      <w:r>
+        <w:rPr>
+          <w:rFonts w:ascii="Times New Roman" w:hAnsi="Times New Roman" w:cs="Times New Roman"/>
+          <w:sz w:val="24"/>
+        </w:rPr>
+        <w:t>templates</w:t>
+      </w:r>
+      <w:proofErr w:type="spellEnd"/>
+      <w:r>
+        <w:rPr>
+          <w:rFonts w:ascii="Times New Roman" w:hAnsi="Times New Roman" w:cs="Times New Roman"/>
+          <w:sz w:val="24"/>
+        </w:rPr>
+        <w:t xml:space="preserve"> </w:t>
+      </w:r>
+      <w:proofErr w:type="spellStart"/>
+      <w:r>
+        <w:rPr>
+          <w:rFonts w:ascii="Times New Roman" w:hAnsi="Times New Roman" w:cs="Times New Roman"/>
+          <w:sz w:val="24"/>
+        </w:rPr>
+        <w:t>validated</w:t>
+      </w:r>
+      <w:proofErr w:type="spellEnd"/>
+      <w:r>
+        <w:rPr>
+          <w:rFonts w:ascii="Times New Roman" w:hAnsi="Times New Roman" w:cs="Times New Roman"/>
+          <w:sz w:val="24"/>
+        </w:rPr>
+        <w:t xml:space="preserve"> </w:t>
+      </w:r>
+      <w:proofErr w:type="spellStart"/>
+      <w:r>
+        <w:rPr>
+          <w:rFonts w:ascii="Times New Roman" w:hAnsi="Times New Roman" w:cs="Times New Roman"/>
+          <w:sz w:val="24"/>
+        </w:rPr>
+        <w:t>successfully</w:t>
+      </w:r>
+      <w:proofErr w:type="spellEnd"/>
+    </w:p>
+    <w:p>
+      <w:pPr>
+        <w:rPr>
+          <w:rFonts w:ascii="Times New Roman" w:hAnsi="Times New Roman" w:cs="Times New Roman"/>
+          <w:sz w:val="24"/>
+        </w:rPr>
+      </w:pPr>
+    </w:p>
+    <w:p>
+      <w:pPr>
         <w:rPr>
           <w:rFonts w:ascii="Times New Roman" w:hAnsi="Times New Roman" w:cs="Times New Roman"/>
           <w:sz w:val="24"/>
@@ -2179,299 +2394,6 @@
       </w:pPr>
       <w:bookmarkStart w:id="0" w:name="_GoBack"/>
       <w:bookmarkEnd w:id="0"/>
-      <w:r>
-        <w:rPr>
-          <w:rFonts w:ascii="Times New Roman" w:hAnsi="Times New Roman" w:cs="Times New Roman"/>
-          <w:sz w:val="24"/>
-        </w:rPr>
-        <w:t xml:space="preserve">Использовано 3 </w:t>
-      </w:r>
-      <w:proofErr w:type="spellStart"/>
-      <w:r>
-        <w:rPr>
-          <w:rFonts w:ascii="Times New Roman" w:hAnsi="Times New Roman" w:cs="Times New Roman"/>
-          <w:sz w:val="24"/>
-        </w:rPr>
-        <w:t>matcher</w:t>
-      </w:r>
-      <w:proofErr w:type="spellEnd"/>
-      <w:r>
-        <w:rPr>
-          <w:rFonts w:ascii="Times New Roman" w:hAnsi="Times New Roman" w:cs="Times New Roman"/>
-          <w:sz w:val="24"/>
-        </w:rPr>
-        <w:t xml:space="preserve"> для улучшенного обнаружения</w:t>
-      </w:r>
-      <w:r>
-        <w:rPr>
-          <w:rFonts w:ascii="Times New Roman" w:hAnsi="Times New Roman" w:cs="Times New Roman"/>
-          <w:sz w:val="24"/>
-        </w:rPr>
-        <w:t xml:space="preserve">, а также выведена строка, в которой найдена проблема. </w:t>
-      </w:r>
-    </w:p>
-    <w:p>
-      <w:pPr>
-        <w:rPr>
-          <w:rFonts w:ascii="Times New Roman" w:hAnsi="Times New Roman" w:cs="Times New Roman"/>
-          <w:sz w:val="24"/>
-        </w:rPr>
-      </w:pPr>
-      <w:r>
-        <w:rPr>
-          <w:rFonts w:ascii="Times New Roman" w:hAnsi="Times New Roman" w:cs="Times New Roman"/>
-          <w:sz w:val="24"/>
-        </w:rPr>
-        <w:t>Шаблоны</w:t>
-      </w:r>
-      <w:r>
-        <w:rPr>
-          <w:rFonts w:ascii="Times New Roman" w:hAnsi="Times New Roman" w:cs="Times New Roman"/>
-          <w:sz w:val="24"/>
-        </w:rPr>
-        <w:t xml:space="preserve"> </w:t>
-      </w:r>
-      <w:r>
-        <w:rPr>
-          <w:rFonts w:ascii="Times New Roman" w:hAnsi="Times New Roman" w:cs="Times New Roman"/>
-          <w:sz w:val="24"/>
-        </w:rPr>
-        <w:t>валидны</w:t>
-      </w:r>
-      <w:r>
-        <w:rPr>
-          <w:rFonts w:ascii="Times New Roman" w:hAnsi="Times New Roman" w:cs="Times New Roman"/>
-          <w:sz w:val="24"/>
-        </w:rPr>
-        <w:t>:</w:t>
-      </w:r>
-    </w:p>
-    <w:p>
-      <w:pPr>
-        <w:rPr>
-          <w:rFonts w:ascii="Times New Roman" w:hAnsi="Times New Roman" w:cs="Times New Roman"/>
-          <w:b/>
-          <w:sz w:val="24"/>
-          <w:lang w:val="en-US"/>
-        </w:rPr>
-      </w:pPr>
-      <w:proofErr w:type="gramStart"/>
-      <w:r>
-        <w:rPr>
-          <w:rFonts w:ascii="Times New Roman" w:hAnsi="Times New Roman" w:cs="Times New Roman"/>
-          <w:b/>
-          <w:sz w:val="24"/>
-          <w:lang w:val="en-US"/>
-        </w:rPr>
-        <w:t>nuclei</w:t>
-      </w:r>
-      <w:proofErr w:type="gramEnd"/>
-      <w:r>
-        <w:rPr>
-          <w:rFonts w:ascii="Times New Roman" w:hAnsi="Times New Roman" w:cs="Times New Roman"/>
-          <w:b/>
-          <w:sz w:val="24"/>
-          <w:lang w:val="en-US"/>
-        </w:rPr>
-        <w:t xml:space="preserve"> -validate -t </w:t>
-      </w:r>
-      <w:proofErr w:type="spellStart"/>
-      <w:r>
-        <w:rPr>
-          <w:rFonts w:ascii="Times New Roman" w:hAnsi="Times New Roman" w:cs="Times New Roman"/>
-          <w:b/>
-          <w:sz w:val="24"/>
-          <w:lang w:val="en-US"/>
-        </w:rPr>
-        <w:t>cves</w:t>
-      </w:r>
-      <w:proofErr w:type="spellEnd"/>
-      <w:r>
-        <w:rPr>
-          <w:rFonts w:ascii="Times New Roman" w:hAnsi="Times New Roman" w:cs="Times New Roman"/>
-          <w:b/>
-          <w:sz w:val="24"/>
-          <w:lang w:val="en-US"/>
-        </w:rPr>
-        <w:t>/</w:t>
-      </w:r>
-    </w:p>
-    <w:p>
-      <w:pPr>
-        <w:spacing w:after="0" w:line="240" w:lineRule="atLeast"/>
-        <w:rPr>
-          <w:rFonts w:ascii="Times New Roman" w:hAnsi="Times New Roman" w:cs="Times New Roman"/>
-          <w:sz w:val="24"/>
-          <w:lang w:val="en-US"/>
-        </w:rPr>
-      </w:pPr>
-      <w:r>
-        <w:rPr>
-          <w:rFonts w:ascii="Times New Roman" w:hAnsi="Times New Roman" w:cs="Times New Roman"/>
-          <w:sz w:val="24"/>
-          <w:lang w:val="en-US"/>
-        </w:rPr>
-        <w:t>[VER] Started metrics server at localhost</w:t>
-      </w:r>
-      <w:proofErr w:type="gramStart"/>
-      <w:r>
-        <w:rPr>
-          <w:rFonts w:ascii="Times New Roman" w:hAnsi="Times New Roman" w:cs="Times New Roman"/>
-          <w:sz w:val="24"/>
-          <w:lang w:val="en-US"/>
-        </w:rPr>
-        <w:t>:9092</w:t>
-      </w:r>
-      <w:proofErr w:type="gramEnd"/>
-    </w:p>
-    <w:p>
-      <w:pPr>
-        <w:spacing w:after="0" w:line="240" w:lineRule="atLeast"/>
-        <w:rPr>
-          <w:rFonts w:ascii="Times New Roman" w:hAnsi="Times New Roman" w:cs="Times New Roman"/>
-          <w:sz w:val="24"/>
-        </w:rPr>
-      </w:pPr>
-      <w:r>
-        <w:rPr>
-          <w:rFonts w:ascii="Times New Roman" w:hAnsi="Times New Roman" w:cs="Times New Roman"/>
-          <w:sz w:val="24"/>
-        </w:rPr>
-        <w:t xml:space="preserve">[INF] </w:t>
-      </w:r>
-      <w:proofErr w:type="spellStart"/>
-      <w:r>
-        <w:rPr>
-          <w:rFonts w:ascii="Times New Roman" w:hAnsi="Times New Roman" w:cs="Times New Roman"/>
-          <w:sz w:val="24"/>
-        </w:rPr>
-        <w:t>All</w:t>
-      </w:r>
-      <w:proofErr w:type="spellEnd"/>
-      <w:r>
-        <w:rPr>
-          <w:rFonts w:ascii="Times New Roman" w:hAnsi="Times New Roman" w:cs="Times New Roman"/>
-          <w:sz w:val="24"/>
-        </w:rPr>
-        <w:t xml:space="preserve"> </w:t>
-      </w:r>
-      <w:proofErr w:type="spellStart"/>
-      <w:r>
-        <w:rPr>
-          <w:rFonts w:ascii="Times New Roman" w:hAnsi="Times New Roman" w:cs="Times New Roman"/>
-          <w:sz w:val="24"/>
-        </w:rPr>
-        <w:t>templates</w:t>
-      </w:r>
-      <w:proofErr w:type="spellEnd"/>
-      <w:r>
-        <w:rPr>
-          <w:rFonts w:ascii="Times New Roman" w:hAnsi="Times New Roman" w:cs="Times New Roman"/>
-          <w:sz w:val="24"/>
-        </w:rPr>
-        <w:t xml:space="preserve"> </w:t>
-      </w:r>
-      <w:proofErr w:type="spellStart"/>
-      <w:r>
-        <w:rPr>
-          <w:rFonts w:ascii="Times New Roman" w:hAnsi="Times New Roman" w:cs="Times New Roman"/>
-          <w:sz w:val="24"/>
-        </w:rPr>
-        <w:t>validated</w:t>
-      </w:r>
-      <w:proofErr w:type="spellEnd"/>
-      <w:r>
-        <w:rPr>
-          <w:rFonts w:ascii="Times New Roman" w:hAnsi="Times New Roman" w:cs="Times New Roman"/>
-          <w:sz w:val="24"/>
-        </w:rPr>
-        <w:t xml:space="preserve"> </w:t>
-      </w:r>
-      <w:proofErr w:type="spellStart"/>
-      <w:r>
-        <w:rPr>
-          <w:rFonts w:ascii="Times New Roman" w:hAnsi="Times New Roman" w:cs="Times New Roman"/>
-          <w:sz w:val="24"/>
-        </w:rPr>
-        <w:t>successfully</w:t>
-      </w:r>
-      <w:proofErr w:type="spellEnd"/>
-    </w:p>
-    <w:p>
-      <w:pPr>
-        <w:rPr>
-          <w:rFonts w:ascii="Times New Roman" w:hAnsi="Times New Roman" w:cs="Times New Roman"/>
-          <w:sz w:val="24"/>
-        </w:rPr>
-      </w:pPr>
-    </w:p>
-    <w:p>
-      <w:pPr>
-        <w:rPr>
-          <w:rFonts w:ascii="Times New Roman" w:hAnsi="Times New Roman" w:cs="Times New Roman"/>
-          <w:sz w:val="24"/>
-        </w:rPr>
-      </w:pPr>
-      <w:r>
-        <w:rPr>
-          <w:rFonts w:ascii="Times New Roman" w:hAnsi="Times New Roman" w:cs="Times New Roman"/>
-          <w:sz w:val="24"/>
-        </w:rPr>
-        <w:t>Ш</w:t>
-      </w:r>
-      <w:r>
-        <w:rPr>
-          <w:rFonts w:ascii="Times New Roman" w:hAnsi="Times New Roman" w:cs="Times New Roman"/>
-          <w:sz w:val="24"/>
-        </w:rPr>
-        <w:t>аблон</w:t>
-      </w:r>
-      <w:r>
-        <w:rPr>
-          <w:rFonts w:ascii="Times New Roman" w:hAnsi="Times New Roman" w:cs="Times New Roman"/>
-          <w:sz w:val="24"/>
-        </w:rPr>
-        <w:t xml:space="preserve"> </w:t>
-      </w:r>
-      <w:r>
-        <w:rPr>
-          <w:rFonts w:ascii="Times New Roman" w:hAnsi="Times New Roman" w:cs="Times New Roman"/>
-          <w:sz w:val="24"/>
-        </w:rPr>
-        <w:t>для</w:t>
-      </w:r>
-      <w:r>
-        <w:rPr>
-          <w:rFonts w:ascii="Times New Roman" w:hAnsi="Times New Roman" w:cs="Times New Roman"/>
-          <w:sz w:val="24"/>
-        </w:rPr>
-        <w:t xml:space="preserve"> </w:t>
-      </w:r>
-      <w:proofErr w:type="spellStart"/>
-      <w:r>
-        <w:rPr>
-          <w:rFonts w:ascii="Times New Roman" w:hAnsi="Times New Roman" w:cs="Times New Roman"/>
-          <w:sz w:val="24"/>
-          <w:lang w:val="en-US"/>
-        </w:rPr>
-        <w:t>domxss</w:t>
-      </w:r>
-      <w:proofErr w:type="spellEnd"/>
-      <w:r>
-        <w:rPr>
-          <w:rFonts w:ascii="Times New Roman" w:hAnsi="Times New Roman" w:cs="Times New Roman"/>
-          <w:sz w:val="24"/>
-        </w:rPr>
-        <w:t>-</w:t>
-      </w:r>
-      <w:r>
-        <w:rPr>
-          <w:rFonts w:ascii="Times New Roman" w:hAnsi="Times New Roman" w:cs="Times New Roman"/>
-          <w:sz w:val="24"/>
-          <w:lang w:val="en-US"/>
-        </w:rPr>
-        <w:t>demo</w:t>
-      </w:r>
     </w:p>
     <w:sectPr>
       <w:pgSz w:w="11906" w:h="16838"/>

</xml_diff>